<commit_message>
Add final PDF report, AI chat log, and embed figures in report
</commit_message>
<xml_diff>
--- a/D1_Report2.docx
+++ b/D1_Report2.docx
@@ -4,6 +4,631 @@
   <w:body>
     <w:p>
       <w:pPr>
+        <w:spacing w:line="592" w:lineRule="auto"/>
+        <w:ind w:left="2096" w:right="2368" w:firstLine="7"/>
+        <w:jc w:val="center"/>
+        <w:rPr>
+          <w:rFonts w:ascii="Times New Roman" w:hAnsi="Times New Roman" w:cs="Times New Roman"/>
+          <w:b/>
+        </w:rPr>
+      </w:pPr>
+      <w:r>
+        <w:rPr>
+          <w:rFonts w:ascii="Times New Roman" w:hAnsi="Times New Roman" w:cs="Times New Roman"/>
+          <w:noProof/>
+        </w:rPr>
+        <w:drawing>
+          <wp:anchor distT="0" distB="0" distL="114300" distR="114300" simplePos="0" relativeHeight="251659264" behindDoc="1" locked="0" layoutInCell="1" allowOverlap="1" wp14:anchorId="47F8CBE3" wp14:editId="2EB28BC6">
+            <wp:simplePos x="0" y="0"/>
+            <wp:positionH relativeFrom="column">
+              <wp:posOffset>931545</wp:posOffset>
+            </wp:positionH>
+            <wp:positionV relativeFrom="paragraph">
+              <wp:posOffset>0</wp:posOffset>
+            </wp:positionV>
+            <wp:extent cx="4570730" cy="1003935"/>
+            <wp:effectExtent l="0" t="0" r="0" b="0"/>
+            <wp:wrapThrough wrapText="bothSides">
+              <wp:wrapPolygon edited="0">
+                <wp:start x="9123" y="2186"/>
+                <wp:lineTo x="3961" y="3006"/>
+                <wp:lineTo x="3421" y="3279"/>
+                <wp:lineTo x="3421" y="7104"/>
+                <wp:lineTo x="1560" y="7651"/>
+                <wp:lineTo x="240" y="9564"/>
+                <wp:lineTo x="240" y="13662"/>
+                <wp:lineTo x="3781" y="15848"/>
+                <wp:lineTo x="4321" y="15848"/>
+                <wp:lineTo x="4321" y="19400"/>
+                <wp:lineTo x="9123" y="20493"/>
+                <wp:lineTo x="13144" y="20493"/>
+                <wp:lineTo x="15484" y="19947"/>
+                <wp:lineTo x="17705" y="18034"/>
+                <wp:lineTo x="17585" y="15848"/>
+                <wp:lineTo x="20166" y="15848"/>
+                <wp:lineTo x="21426" y="14482"/>
+                <wp:lineTo x="21486" y="9837"/>
+                <wp:lineTo x="20286" y="9017"/>
+                <wp:lineTo x="15604" y="6285"/>
+                <wp:lineTo x="14464" y="4099"/>
+                <wp:lineTo x="13144" y="2186"/>
+                <wp:lineTo x="9123" y="2186"/>
+              </wp:wrapPolygon>
+            </wp:wrapThrough>
+            <wp:docPr id="6" name="Picture 5" descr="Logo&#10;&#10;Description automatically generated">
+              <a:extLst xmlns:a="http://schemas.openxmlformats.org/drawingml/2006/main">
+                <a:ext uri="{FF2B5EF4-FFF2-40B4-BE49-F238E27FC236}">
+                  <a16:creationId xmlns:a16="http://schemas.microsoft.com/office/drawing/2014/main" id="{40055341-7B94-278B-3099-5B7E9940EC44}"/>
+                </a:ext>
+              </a:extLst>
+            </wp:docPr>
+            <wp:cNvGraphicFramePr>
+              <a:graphicFrameLocks xmlns:a="http://schemas.openxmlformats.org/drawingml/2006/main" noChangeAspect="1"/>
+            </wp:cNvGraphicFramePr>
+            <a:graphic xmlns:a="http://schemas.openxmlformats.org/drawingml/2006/main">
+              <a:graphicData uri="http://schemas.openxmlformats.org/drawingml/2006/picture">
+                <pic:pic xmlns:pic="http://schemas.openxmlformats.org/drawingml/2006/picture">
+                  <pic:nvPicPr>
+                    <pic:cNvPr id="6" name="Picture 5" descr="Logo&#10;&#10;Description automatically generated">
+                      <a:extLst>
+                        <a:ext uri="{FF2B5EF4-FFF2-40B4-BE49-F238E27FC236}">
+                          <a16:creationId xmlns:a16="http://schemas.microsoft.com/office/drawing/2014/main" id="{40055341-7B94-278B-3099-5B7E9940EC44}"/>
+                        </a:ext>
+                      </a:extLst>
+                    </pic:cNvPr>
+                    <pic:cNvPicPr>
+                      <a:picLocks noChangeAspect="1"/>
+                    </pic:cNvPicPr>
+                  </pic:nvPicPr>
+                  <pic:blipFill>
+                    <a:blip r:embed="rId7">
+                      <a:extLst>
+                        <a:ext uri="{28A0092B-C50C-407E-A947-70E740481C1C}">
+                          <a14:useLocalDpi xmlns:a14="http://schemas.microsoft.com/office/drawing/2010/main" val="0"/>
+                        </a:ext>
+                      </a:extLst>
+                    </a:blip>
+                    <a:stretch>
+                      <a:fillRect/>
+                    </a:stretch>
+                  </pic:blipFill>
+                  <pic:spPr>
+                    <a:xfrm>
+                      <a:off x="0" y="0"/>
+                      <a:ext cx="4570730" cy="1003935"/>
+                    </a:xfrm>
+                    <a:prstGeom prst="rect">
+                      <a:avLst/>
+                    </a:prstGeom>
+                  </pic:spPr>
+                </pic:pic>
+              </a:graphicData>
+            </a:graphic>
+            <wp14:sizeRelH relativeFrom="page">
+              <wp14:pctWidth>0</wp14:pctWidth>
+            </wp14:sizeRelH>
+            <wp14:sizeRelV relativeFrom="page">
+              <wp14:pctHeight>0</wp14:pctHeight>
+            </wp14:sizeRelV>
+          </wp:anchor>
+        </w:drawing>
+      </w:r>
+    </w:p>
+    <w:p>
+      <w:pPr>
+        <w:spacing w:line="592" w:lineRule="auto"/>
+        <w:ind w:right="2368"/>
+        <w:rPr>
+          <w:rFonts w:ascii="Times New Roman" w:hAnsi="Times New Roman" w:cs="Times New Roman"/>
+          <w:b/>
+        </w:rPr>
+      </w:pPr>
+    </w:p>
+    <w:p>
+      <w:pPr>
+        <w:spacing w:line="592" w:lineRule="auto"/>
+        <w:ind w:left="2096" w:right="2368" w:firstLine="7"/>
+        <w:jc w:val="center"/>
+        <w:rPr>
+          <w:rFonts w:ascii="Times New Roman" w:hAnsi="Times New Roman" w:cs="Times New Roman"/>
+          <w:b/>
+        </w:rPr>
+      </w:pPr>
+    </w:p>
+    <w:p>
+      <w:pPr>
+        <w:spacing w:line="592" w:lineRule="auto"/>
+        <w:ind w:left="2096" w:right="2368" w:firstLine="7"/>
+        <w:jc w:val="center"/>
+        <w:rPr>
+          <w:rFonts w:ascii="Times New Roman" w:hAnsi="Times New Roman" w:cs="Times New Roman"/>
+          <w:b/>
+        </w:rPr>
+      </w:pPr>
+    </w:p>
+    <w:p>
+      <w:pPr>
+        <w:bidi/>
+        <w:spacing w:line="590" w:lineRule="auto"/>
+        <w:ind w:left="368" w:right="637"/>
+        <w:jc w:val="center"/>
+        <w:rPr>
+          <w:rFonts w:ascii="Times New Roman" w:hAnsi="Times New Roman" w:cs="Times New Roman"/>
+          <w:b/>
+          <w:bCs/>
+        </w:rPr>
+      </w:pPr>
+      <w:r>
+        <w:rPr>
+          <w:rFonts w:ascii="Times New Roman" w:hAnsi="Times New Roman" w:cs="Times New Roman"/>
+          <w:b/>
+          <w:bCs/>
+        </w:rPr>
+        <w:t>Special Topic in AI</w:t>
+      </w:r>
+      <w:r>
+        <w:rPr>
+          <w:rFonts w:ascii="Times New Roman" w:hAnsi="Times New Roman" w:cs="Times New Roman"/>
+          <w:b/>
+          <w:bCs/>
+        </w:rPr>
+        <w:t xml:space="preserve">: </w:t>
+      </w:r>
+      <w:r>
+        <w:rPr>
+          <w:rFonts w:ascii="Times New Roman" w:hAnsi="Times New Roman" w:cs="Times New Roman"/>
+          <w:b/>
+          <w:bCs/>
+        </w:rPr>
+        <w:t>Report Deliverable 1</w:t>
+      </w:r>
+    </w:p>
+    <w:p>
+      <w:pPr>
+        <w:bidi/>
+        <w:spacing w:line="590" w:lineRule="auto"/>
+        <w:ind w:left="368" w:right="637"/>
+        <w:jc w:val="center"/>
+        <w:rPr>
+          <w:rFonts w:ascii="Times New Roman" w:hAnsi="Times New Roman" w:cs="Times New Roman"/>
+        </w:rPr>
+      </w:pPr>
+      <w:r>
+        <w:rPr>
+          <w:rFonts w:ascii="Times New Roman" w:hAnsi="Times New Roman" w:cs="Times New Roman"/>
+        </w:rPr>
+        <w:t xml:space="preserve"> </w:t>
+      </w:r>
+      <w:r>
+        <w:rPr>
+          <w:rFonts w:ascii="Times New Roman" w:hAnsi="Times New Roman" w:cs="Times New Roman"/>
+        </w:rPr>
+        <w:t>CSAI415_APR26 - Special Topics in AI</w:t>
+      </w:r>
+    </w:p>
+    <w:p>
+      <w:pPr>
+        <w:bidi/>
+        <w:spacing w:line="592" w:lineRule="auto"/>
+        <w:ind w:left="2096" w:right="2368" w:firstLine="7"/>
+        <w:jc w:val="center"/>
+        <w:rPr>
+          <w:rFonts w:ascii="Times New Roman" w:hAnsi="Times New Roman" w:cs="Times New Roman"/>
+          <w:b/>
+        </w:rPr>
+      </w:pPr>
+      <w:r>
+        <w:rPr>
+          <w:rFonts w:ascii="Times New Roman" w:hAnsi="Times New Roman" w:cs="Times New Roman"/>
+        </w:rPr>
+        <w:t>‘</w:t>
+      </w:r>
+      <w:r>
+        <w:rPr>
+          <w:rFonts w:ascii="Times New Roman" w:hAnsi="Times New Roman" w:cs="Times New Roman"/>
+        </w:rPr>
+        <w:t>Spring</w:t>
+      </w:r>
+      <w:r>
+        <w:rPr>
+          <w:rFonts w:ascii="Times New Roman" w:hAnsi="Times New Roman" w:cs="Times New Roman"/>
+        </w:rPr>
+        <w:t xml:space="preserve"> 202</w:t>
+      </w:r>
+      <w:r>
+        <w:rPr>
+          <w:rFonts w:ascii="Times New Roman" w:hAnsi="Times New Roman" w:cs="Times New Roman"/>
+        </w:rPr>
+        <w:t>6</w:t>
+      </w:r>
+      <w:r>
+        <w:rPr>
+          <w:rFonts w:ascii="Times New Roman" w:hAnsi="Times New Roman" w:cs="Times New Roman"/>
+        </w:rPr>
+        <w:t>’</w:t>
+      </w:r>
+    </w:p>
+    <w:p>
+      <w:pPr>
+        <w:bidi/>
+        <w:spacing w:line="590" w:lineRule="auto"/>
+        <w:ind w:left="3007" w:right="3281"/>
+        <w:jc w:val="center"/>
+        <w:rPr>
+          <w:rFonts w:ascii="Times New Roman" w:hAnsi="Times New Roman" w:cs="Times New Roman"/>
+        </w:rPr>
+      </w:pPr>
+      <w:r>
+        <w:rPr>
+          <w:rFonts w:ascii="Times New Roman" w:hAnsi="Times New Roman" w:cs="Times New Roman"/>
+        </w:rPr>
+        <w:t>‘</w:t>
+      </w:r>
+      <w:r>
+        <w:rPr>
+          <w:rFonts w:ascii="Times New Roman" w:hAnsi="Times New Roman" w:cs="Times New Roman"/>
+        </w:rPr>
+        <w:t>Report</w:t>
+      </w:r>
+      <w:r>
+        <w:rPr>
+          <w:rFonts w:ascii="Times New Roman" w:hAnsi="Times New Roman" w:cs="Times New Roman"/>
+        </w:rPr>
+        <w:t>:</w:t>
+      </w:r>
+      <w:r>
+        <w:rPr>
+          <w:rFonts w:ascii="Times New Roman" w:hAnsi="Times New Roman" w:cs="Times New Roman"/>
+          <w:spacing w:val="-15"/>
+        </w:rPr>
+        <w:t xml:space="preserve"> </w:t>
+      </w:r>
+      <w:r>
+        <w:rPr>
+          <w:rFonts w:ascii="Times New Roman" w:hAnsi="Times New Roman" w:cs="Times New Roman"/>
+        </w:rPr>
+        <w:t xml:space="preserve">Week </w:t>
+      </w:r>
+      <w:r>
+        <w:rPr>
+          <w:rFonts w:ascii="Times New Roman" w:hAnsi="Times New Roman" w:cs="Times New Roman"/>
+          <w:lang w:val="en-US"/>
+        </w:rPr>
+        <w:t>5</w:t>
+      </w:r>
+      <w:r>
+        <w:rPr>
+          <w:rFonts w:ascii="Times New Roman" w:hAnsi="Times New Roman" w:cs="Times New Roman"/>
+        </w:rPr>
+        <w:t xml:space="preserve">’ </w:t>
+      </w:r>
+    </w:p>
+    <w:p>
+      <w:pPr>
+        <w:bidi/>
+        <w:spacing w:line="590" w:lineRule="auto"/>
+        <w:ind w:left="368" w:right="637"/>
+        <w:jc w:val="center"/>
+        <w:rPr>
+          <w:rFonts w:ascii="Times New Roman" w:hAnsi="Times New Roman" w:cs="Times New Roman"/>
+        </w:rPr>
+      </w:pPr>
+      <w:r>
+        <w:rPr>
+          <w:rFonts w:ascii="Times New Roman" w:hAnsi="Times New Roman" w:cs="Times New Roman"/>
+        </w:rPr>
+        <w:t>Gamze Okmen (22001694)</w:t>
+      </w:r>
+      <w:r>
+        <w:rPr>
+          <w:rFonts w:ascii="Times New Roman" w:hAnsi="Times New Roman" w:cs="Times New Roman"/>
+        </w:rPr>
+        <w:t xml:space="preserve">, </w:t>
+      </w:r>
+      <w:r>
+        <w:rPr>
+          <w:rFonts w:ascii="Times New Roman" w:eastAsia="Times New Roman" w:hAnsi="Times New Roman" w:cs="Times New Roman"/>
+          <w:kern w:val="0"/>
+          <w14:ligatures w14:val="none"/>
+        </w:rPr>
+        <w:t>Kenan Almukhllati</w:t>
+      </w:r>
+      <w:r>
+        <w:rPr>
+          <w:rFonts w:ascii="Times New Roman" w:eastAsia="Times New Roman" w:hAnsi="Times New Roman" w:cs="Times New Roman"/>
+          <w:kern w:val="0"/>
+          <w14:ligatures w14:val="none"/>
+        </w:rPr>
+        <w:t xml:space="preserve"> (</w:t>
+      </w:r>
+      <w:r>
+        <w:rPr>
+          <w:rFonts w:ascii="Times New Roman" w:eastAsia="Times New Roman" w:hAnsi="Times New Roman" w:cs="Times New Roman"/>
+          <w:kern w:val="0"/>
+          <w14:ligatures w14:val="none"/>
+        </w:rPr>
+        <w:t>2200067</w:t>
+      </w:r>
+      <w:r>
+        <w:rPr>
+          <w:rFonts w:ascii="Times New Roman" w:eastAsia="Times New Roman" w:hAnsi="Times New Roman" w:cs="Times New Roman"/>
+          <w:kern w:val="0"/>
+          <w14:ligatures w14:val="none"/>
+        </w:rPr>
+        <w:t xml:space="preserve">5), </w:t>
+      </w:r>
+      <w:r>
+        <w:rPr>
+          <w:rFonts w:ascii="Times New Roman" w:eastAsia="Times New Roman" w:hAnsi="Times New Roman" w:cs="Times New Roman"/>
+          <w:kern w:val="0"/>
+          <w14:ligatures w14:val="none"/>
+        </w:rPr>
+        <w:t>Alfarouq Alsharif</w:t>
+      </w:r>
+      <w:r>
+        <w:rPr>
+          <w:rFonts w:ascii="Times New Roman" w:eastAsia="Times New Roman" w:hAnsi="Times New Roman" w:cs="Times New Roman"/>
+          <w:kern w:val="0"/>
+          <w14:ligatures w14:val="none"/>
+        </w:rPr>
+        <w:t xml:space="preserve"> (</w:t>
+      </w:r>
+      <w:r>
+        <w:rPr>
+          <w:rFonts w:ascii="Times New Roman" w:eastAsia="Times New Roman" w:hAnsi="Times New Roman" w:cs="Times New Roman"/>
+          <w:kern w:val="0"/>
+          <w14:ligatures w14:val="none"/>
+        </w:rPr>
+        <w:t>22000440</w:t>
+      </w:r>
+      <w:r>
+        <w:rPr>
+          <w:rFonts w:ascii="Times New Roman" w:eastAsia="Times New Roman" w:hAnsi="Times New Roman" w:cs="Times New Roman"/>
+          <w:kern w:val="0"/>
+          <w14:ligatures w14:val="none"/>
+        </w:rPr>
+        <w:t>)</w:t>
+      </w:r>
+    </w:p>
+    <w:p>
+      <w:pPr>
+        <w:bidi/>
+        <w:spacing w:line="590" w:lineRule="auto"/>
+        <w:ind w:left="368" w:right="637"/>
+        <w:jc w:val="center"/>
+        <w:rPr>
+          <w:rFonts w:ascii="Times New Roman" w:hAnsi="Times New Roman" w:cs="Times New Roman"/>
+        </w:rPr>
+      </w:pPr>
+      <w:r>
+        <w:rPr>
+          <w:rFonts w:ascii="Times New Roman" w:hAnsi="Times New Roman" w:cs="Times New Roman"/>
+        </w:rPr>
+        <w:t>“</w:t>
+      </w:r>
+      <w:r>
+        <w:rPr>
+          <w:rFonts w:ascii="Times New Roman" w:hAnsi="Times New Roman" w:cs="Times New Roman"/>
+        </w:rPr>
+        <w:t>Analysis of a Real-World Robot System</w:t>
+      </w:r>
+      <w:r>
+        <w:rPr>
+          <w:rFonts w:ascii="Times New Roman" w:hAnsi="Times New Roman" w:cs="Times New Roman"/>
+        </w:rPr>
+        <w:t xml:space="preserve"> (</w:t>
+      </w:r>
+      <w:r>
+        <w:rPr>
+          <w:rFonts w:ascii="Times New Roman" w:hAnsi="Times New Roman" w:cs="Times New Roman"/>
+        </w:rPr>
+        <w:t>Boston Dynamics Atlas</w:t>
+      </w:r>
+      <w:r>
+        <w:rPr>
+          <w:rFonts w:ascii="Times New Roman" w:hAnsi="Times New Roman" w:cs="Times New Roman"/>
+        </w:rPr>
+        <w:t>)</w:t>
+      </w:r>
+      <w:r>
+        <w:rPr>
+          <w:rFonts w:ascii="Times New Roman" w:hAnsi="Times New Roman" w:cs="Times New Roman"/>
+        </w:rPr>
+        <w:t>”</w:t>
+      </w:r>
+    </w:p>
+    <w:p>
+      <w:pPr>
+        <w:bidi/>
+        <w:spacing w:line="590" w:lineRule="auto"/>
+        <w:ind w:left="368" w:right="637"/>
+        <w:jc w:val="center"/>
+        <w:rPr>
+          <w:rFonts w:ascii="Times New Roman" w:hAnsi="Times New Roman" w:cs="Times New Roman"/>
+        </w:rPr>
+      </w:pPr>
+      <w:r>
+        <w:rPr>
+          <w:rFonts w:ascii="Times New Roman" w:hAnsi="Times New Roman" w:cs="Times New Roman"/>
+        </w:rPr>
+        <w:t>Department</w:t>
+      </w:r>
+      <w:r>
+        <w:rPr>
+          <w:rFonts w:ascii="Times New Roman" w:hAnsi="Times New Roman" w:cs="Times New Roman"/>
+          <w:spacing w:val="-2"/>
+        </w:rPr>
+        <w:t xml:space="preserve"> </w:t>
+      </w:r>
+      <w:r>
+        <w:rPr>
+          <w:rFonts w:ascii="Times New Roman" w:hAnsi="Times New Roman" w:cs="Times New Roman"/>
+        </w:rPr>
+        <w:t>of</w:t>
+      </w:r>
+      <w:r>
+        <w:rPr>
+          <w:rFonts w:ascii="Times New Roman" w:hAnsi="Times New Roman" w:cs="Times New Roman"/>
+          <w:spacing w:val="-5"/>
+        </w:rPr>
+        <w:t xml:space="preserve"> </w:t>
+      </w:r>
+      <w:r>
+        <w:rPr>
+          <w:rFonts w:ascii="Times New Roman" w:hAnsi="Times New Roman" w:cs="Times New Roman"/>
+        </w:rPr>
+        <w:t>Artificial Intelligence</w:t>
+      </w:r>
+      <w:r>
+        <w:rPr>
+          <w:rFonts w:ascii="Times New Roman" w:hAnsi="Times New Roman" w:cs="Times New Roman"/>
+        </w:rPr>
+        <w:t xml:space="preserve">, </w:t>
+      </w:r>
+      <w:r>
+        <w:rPr>
+          <w:rFonts w:ascii="Times New Roman" w:hAnsi="Times New Roman" w:cs="Times New Roman"/>
+        </w:rPr>
+        <w:t>The</w:t>
+      </w:r>
+      <w:r>
+        <w:rPr>
+          <w:rFonts w:ascii="Times New Roman" w:hAnsi="Times New Roman" w:cs="Times New Roman"/>
+          <w:spacing w:val="-6"/>
+        </w:rPr>
+        <w:t xml:space="preserve"> </w:t>
+      </w:r>
+      <w:r>
+        <w:rPr>
+          <w:rFonts w:ascii="Times New Roman" w:hAnsi="Times New Roman" w:cs="Times New Roman"/>
+        </w:rPr>
+        <w:t>British</w:t>
+      </w:r>
+      <w:r>
+        <w:rPr>
+          <w:rFonts w:ascii="Times New Roman" w:hAnsi="Times New Roman" w:cs="Times New Roman"/>
+          <w:spacing w:val="-5"/>
+        </w:rPr>
+        <w:t xml:space="preserve"> </w:t>
+      </w:r>
+      <w:r>
+        <w:rPr>
+          <w:rFonts w:ascii="Times New Roman" w:hAnsi="Times New Roman" w:cs="Times New Roman"/>
+        </w:rPr>
+        <w:t>University</w:t>
+      </w:r>
+      <w:r>
+        <w:rPr>
+          <w:rFonts w:ascii="Times New Roman" w:hAnsi="Times New Roman" w:cs="Times New Roman"/>
+          <w:spacing w:val="-5"/>
+        </w:rPr>
+        <w:t xml:space="preserve"> </w:t>
+      </w:r>
+      <w:r>
+        <w:rPr>
+          <w:rFonts w:ascii="Times New Roman" w:hAnsi="Times New Roman" w:cs="Times New Roman"/>
+        </w:rPr>
+        <w:t>in</w:t>
+      </w:r>
+      <w:r>
+        <w:rPr>
+          <w:rFonts w:ascii="Times New Roman" w:hAnsi="Times New Roman" w:cs="Times New Roman"/>
+          <w:spacing w:val="-5"/>
+        </w:rPr>
+        <w:t xml:space="preserve"> </w:t>
+      </w:r>
+      <w:r>
+        <w:rPr>
+          <w:rFonts w:ascii="Times New Roman" w:hAnsi="Times New Roman" w:cs="Times New Roman"/>
+        </w:rPr>
+        <w:t xml:space="preserve">Dubai </w:t>
+      </w:r>
+    </w:p>
+    <w:p>
+      <w:pPr>
+        <w:bidi/>
+        <w:spacing w:line="590" w:lineRule="auto"/>
+        <w:ind w:left="368" w:right="637"/>
+        <w:jc w:val="center"/>
+        <w:rPr>
+          <w:rFonts w:ascii="Times New Roman" w:hAnsi="Times New Roman" w:cs="Times New Roman"/>
+        </w:rPr>
+      </w:pPr>
+      <w:r>
+        <w:rPr>
+          <w:rFonts w:ascii="Times New Roman" w:hAnsi="Times New Roman" w:cs="Times New Roman"/>
+        </w:rPr>
+        <w:t>May 17</w:t>
+      </w:r>
+      <w:r>
+        <w:rPr>
+          <w:rFonts w:ascii="Times New Roman" w:hAnsi="Times New Roman" w:cs="Times New Roman"/>
+        </w:rPr>
+        <w:t>, 202</w:t>
+      </w:r>
+      <w:r>
+        <w:rPr>
+          <w:rFonts w:ascii="Times New Roman" w:hAnsi="Times New Roman" w:cs="Times New Roman"/>
+        </w:rPr>
+        <w:t>6</w:t>
+      </w:r>
+    </w:p>
+    <w:p>
+      <w:pPr>
+        <w:bidi/>
+        <w:spacing w:line="590" w:lineRule="auto"/>
+        <w:ind w:left="368" w:right="637"/>
+        <w:jc w:val="center"/>
+        <w:rPr>
+          <w:rFonts w:ascii="Times New Roman" w:hAnsi="Times New Roman" w:cs="Times New Roman"/>
+        </w:rPr>
+      </w:pPr>
+      <w:r>
+        <w:rPr>
+          <w:rFonts w:ascii="Times New Roman" w:hAnsi="Times New Roman" w:cs="Times New Roman"/>
+        </w:rPr>
+        <w:t>‘S</w:t>
+      </w:r>
+      <w:r>
+        <w:rPr>
+          <w:rFonts w:ascii="Times New Roman" w:hAnsi="Times New Roman" w:cs="Times New Roman"/>
+        </w:rPr>
+        <w:t>ubmitted to</w:t>
+      </w:r>
+      <w:r>
+        <w:rPr>
+          <w:rFonts w:ascii="Times New Roman" w:hAnsi="Times New Roman" w:cs="Times New Roman"/>
+        </w:rPr>
+        <w:t>:</w:t>
+      </w:r>
+      <w:r>
+        <w:rPr>
+          <w:rFonts w:ascii="Times New Roman" w:hAnsi="Times New Roman" w:cs="Times New Roman"/>
+          <w:spacing w:val="1"/>
+        </w:rPr>
+        <w:t xml:space="preserve"> </w:t>
+      </w:r>
+      <w:r>
+        <w:rPr>
+          <w:rFonts w:ascii="Times New Roman" w:hAnsi="Times New Roman" w:cs="Times New Roman"/>
+        </w:rPr>
+        <w:t xml:space="preserve">Prof. </w:t>
+      </w:r>
+      <w:r>
+        <w:rPr>
+          <w:rFonts w:ascii="Times New Roman" w:hAnsi="Times New Roman" w:cs="Times New Roman"/>
+        </w:rPr>
+        <w:t>Ahmed Awad</w:t>
+      </w:r>
+      <w:r>
+        <w:rPr>
+          <w:rFonts w:ascii="Times New Roman" w:hAnsi="Times New Roman" w:cs="Times New Roman"/>
+        </w:rPr>
+        <w:t>’</w:t>
+      </w:r>
+    </w:p>
+    <w:p>
+      <w:pPr>
         <w:spacing w:before="100" w:beforeAutospacing="1" w:after="100" w:afterAutospacing="1" w:line="240" w:lineRule="auto"/>
         <w:outlineLvl w:val="1"/>
         <w:rPr>
@@ -16,7 +641,11 @@
           <w14:ligatures w14:val="none"/>
         </w:rPr>
       </w:pPr>
-      <w:r>
+    </w:p>
+    <w:p>
+      <w:pPr>
+        <w:spacing w:before="100" w:beforeAutospacing="1" w:after="100" w:afterAutospacing="1" w:line="240" w:lineRule="auto"/>
+        <w:outlineLvl w:val="1"/>
         <w:rPr>
           <w:rFonts w:ascii="Times New Roman" w:eastAsia="Times New Roman" w:hAnsi="Times New Roman" w:cs="Times New Roman"/>
           <w:b/>
@@ -26,27 +655,34 @@
           <w:szCs w:val="36"/>
           <w14:ligatures w14:val="none"/>
         </w:rPr>
-        <w:t>CSAI415 D1: AutoML and Online Learning for Paper RAG</w:t>
-      </w:r>
+      </w:pPr>
     </w:p>
     <w:p>
       <w:pPr>
         <w:spacing w:before="100" w:beforeAutospacing="1" w:after="100" w:afterAutospacing="1" w:line="240" w:lineRule="auto"/>
-        <w:rPr>
-          <w:rFonts w:ascii="Times New Roman" w:eastAsia="Times New Roman" w:hAnsi="Times New Roman" w:cs="Times New Roman"/>
-          <w:kern w:val="0"/>
-          <w14:ligatures w14:val="none"/>
-        </w:rPr>
-      </w:pPr>
-      <w:r>
-        <w:rPr>
-          <w:rFonts w:ascii="Times New Roman" w:eastAsia="Times New Roman" w:hAnsi="Times New Roman" w:cs="Times New Roman"/>
-          <w:i/>
-          <w:iCs/>
-          <w:kern w:val="0"/>
-          <w14:ligatures w14:val="none"/>
-        </w:rPr>
-        <w:t>Team: Gamze Okmen + 2 members | Track A: Supervised Auto-tuned kNN Retriever | May 17, 2026</w:t>
+        <w:outlineLvl w:val="1"/>
+        <w:rPr>
+          <w:rFonts w:ascii="Times New Roman" w:eastAsia="Times New Roman" w:hAnsi="Times New Roman" w:cs="Times New Roman"/>
+          <w:b/>
+          <w:bCs/>
+          <w:kern w:val="0"/>
+          <w:sz w:val="36"/>
+          <w:szCs w:val="36"/>
+          <w14:ligatures w14:val="none"/>
+        </w:rPr>
+      </w:pPr>
+      <w:r>
+        <w:rPr>
+          <w:rFonts w:ascii="Times New Roman" w:eastAsia="Times New Roman" w:hAnsi="Times New Roman" w:cs="Times New Roman"/>
+          <w:b/>
+          <w:bCs/>
+          <w:kern w:val="0"/>
+          <w:sz w:val="36"/>
+          <w:szCs w:val="36"/>
+          <w14:ligatures w14:val="none"/>
+        </w:rPr>
+        <w:lastRenderedPageBreak/>
+        <w:t>CSAI415 D1: AutoML and Online Learning for Paper RAG</w:t>
       </w:r>
     </w:p>
     <w:p>
@@ -722,7 +1358,6 @@
           <w:szCs w:val="27"/>
           <w14:ligatures w14:val="none"/>
         </w:rPr>
-        <w:lastRenderedPageBreak/>
         <w:t>4. AutoML for Retriever (Optuna TPE, 30 trials, 70/30 train/test split)</w:t>
       </w:r>
     </w:p>
@@ -794,6 +1429,7 @@
                 <w:kern w:val="0"/>
                 <w14:ligatures w14:val="none"/>
               </w:rPr>
+              <w:lastRenderedPageBreak/>
               <w:t>Hyperparameter</w:t>
             </w:r>
           </w:p>
@@ -2156,7 +2792,52 @@
           <w:kern w:val="0"/>
           <w14:ligatures w14:val="none"/>
         </w:rPr>
-        <w:t>[INSERT IMAGE: optuna_convergence.png — width 5.5"]</w:t>
+        <w:lastRenderedPageBreak/>
+        <w:drawing>
+          <wp:inline distT="0" distB="0" distL="0" distR="0" wp14:anchorId="3F2A2855" wp14:editId="51F7C3AA">
+            <wp:extent cx="5943600" cy="2326005"/>
+            <wp:effectExtent l="0" t="0" r="0" b="0"/>
+            <wp:docPr id="1783501279" name="Picture 1"/>
+            <wp:cNvGraphicFramePr>
+              <a:graphicFrameLocks xmlns:a="http://schemas.openxmlformats.org/drawingml/2006/main" noChangeAspect="1"/>
+            </wp:cNvGraphicFramePr>
+            <a:graphic xmlns:a="http://schemas.openxmlformats.org/drawingml/2006/main">
+              <a:graphicData uri="http://schemas.openxmlformats.org/drawingml/2006/picture">
+                <pic:pic xmlns:pic="http://schemas.openxmlformats.org/drawingml/2006/picture">
+                  <pic:nvPicPr>
+                    <pic:cNvPr id="1783501279" name=""/>
+                    <pic:cNvPicPr/>
+                  </pic:nvPicPr>
+                  <pic:blipFill>
+                    <a:blip r:embed="rId8"/>
+                    <a:stretch>
+                      <a:fillRect/>
+                    </a:stretch>
+                  </pic:blipFill>
+                  <pic:spPr>
+                    <a:xfrm>
+                      <a:off x="0" y="0"/>
+                      <a:ext cx="5943600" cy="2326005"/>
+                    </a:xfrm>
+                    <a:prstGeom prst="rect">
+                      <a:avLst/>
+                    </a:prstGeom>
+                  </pic:spPr>
+                </pic:pic>
+              </a:graphicData>
+            </a:graphic>
+          </wp:inline>
+        </w:drawing>
+      </w:r>
+      <w:r>
+        <w:rPr>
+          <w:rFonts w:ascii="Times New Roman" w:eastAsia="Times New Roman" w:hAnsi="Times New Roman" w:cs="Times New Roman"/>
+          <w:i/>
+          <w:iCs/>
+          <w:kern w:val="0"/>
+          <w14:ligatures w14:val="none"/>
+        </w:rPr>
+        <w:t>Figure 1. Optuna TPE convergence over 30 trials.</w:t>
       </w:r>
     </w:p>
     <w:p>
@@ -2171,39 +2852,10 @@
       <w:r>
         <w:rPr>
           <w:rFonts w:ascii="Times New Roman" w:eastAsia="Times New Roman" w:hAnsi="Times New Roman" w:cs="Times New Roman"/>
-          <w:i/>
-          <w:iCs/>
-          <w:kern w:val="0"/>
-          <w14:ligatures w14:val="none"/>
-        </w:rPr>
-        <w:t>Figure 1. Optuna TPE convergence over 30 trials.</w:t>
-      </w:r>
-    </w:p>
-    <w:p>
-      <w:pPr>
-        <w:spacing w:before="100" w:beforeAutospacing="1" w:after="100" w:afterAutospacing="1" w:line="240" w:lineRule="auto"/>
-        <w:rPr>
-          <w:rFonts w:ascii="Times New Roman" w:eastAsia="Times New Roman" w:hAnsi="Times New Roman" w:cs="Times New Roman"/>
-          <w:kern w:val="0"/>
-          <w14:ligatures w14:val="none"/>
-        </w:rPr>
-      </w:pPr>
-      <w:r>
-        <w:rPr>
-          <w:rFonts w:ascii="Times New Roman" w:eastAsia="Times New Roman" w:hAnsi="Times New Roman" w:cs="Times New Roman"/>
-          <w:kern w:val="0"/>
-          <w14:ligatures w14:val="none"/>
-        </w:rPr>
-        <w:t xml:space="preserve">The optimizer chose a dense-heavy fusion (α = 0.879) with the dot-product metric and full 384-dim embeddings, confirming semantic similarity drives this task. The latency-aware objective reduced train p95 from 1,427.7 ms (baseline) to 14.9 ms — a 99 % reduction — without </w:t>
-      </w:r>
-      <w:r>
-        <w:rPr>
-          <w:rFonts w:ascii="Times New Roman" w:eastAsia="Times New Roman" w:hAnsi="Times New Roman" w:cs="Times New Roman"/>
-          <w:kern w:val="0"/>
-          <w14:ligatures w14:val="none"/>
-        </w:rPr>
-        <w:lastRenderedPageBreak/>
-        <w:t xml:space="preserve">sacrificing relevance. Higher test p95 of 423.7 ms reflects cold-start variance over only 3 test queries; well below the 2,000 ms ceiling. Test NDCG and Recall both holding at 1.000 confirms no overfit. Reproducibility record saved as </w:t>
+          <w:kern w:val="0"/>
+          <w14:ligatures w14:val="none"/>
+        </w:rPr>
+        <w:t xml:space="preserve">The optimizer chose a dense-heavy fusion (α = 0.879) with the dot-product metric and full 384-dim embeddings, confirming semantic similarity drives this task. The latency-aware objective reduced train p95 from 1,427.7 ms (baseline) to 14.9 ms — a 99 % reduction — without sacrificing relevance. Higher test p95 of 423.7 ms reflects cold-start variance over only 3 test queries; well below the 2,000 ms ceiling. Test NDCG and Recall both holding at 1.000 confirms no overfit. Reproducibility record saved as </w:t>
       </w:r>
       <w:r>
         <w:rPr>
@@ -2699,18 +3351,43 @@
           <w:kern w:val="0"/>
           <w14:ligatures w14:val="none"/>
         </w:rPr>
-        <w:t>[INSERT IMAGE: adwin_evidence_plot.png — width 5.5"]</w:t>
-      </w:r>
-    </w:p>
-    <w:p>
-      <w:pPr>
-        <w:spacing w:before="100" w:beforeAutospacing="1" w:after="100" w:afterAutospacing="1" w:line="240" w:lineRule="auto"/>
-        <w:rPr>
-          <w:rFonts w:ascii="Times New Roman" w:eastAsia="Times New Roman" w:hAnsi="Times New Roman" w:cs="Times New Roman"/>
-          <w:kern w:val="0"/>
-          <w14:ligatures w14:val="none"/>
-        </w:rPr>
-      </w:pPr>
+        <w:lastRenderedPageBreak/>
+        <w:drawing>
+          <wp:inline distT="0" distB="0" distL="0" distR="0" wp14:anchorId="4BEF404B" wp14:editId="05ADC4C4">
+            <wp:extent cx="5943600" cy="2434590"/>
+            <wp:effectExtent l="0" t="0" r="0" b="3810"/>
+            <wp:docPr id="8713344" name="Picture 1"/>
+            <wp:cNvGraphicFramePr>
+              <a:graphicFrameLocks xmlns:a="http://schemas.openxmlformats.org/drawingml/2006/main" noChangeAspect="1"/>
+            </wp:cNvGraphicFramePr>
+            <a:graphic xmlns:a="http://schemas.openxmlformats.org/drawingml/2006/main">
+              <a:graphicData uri="http://schemas.openxmlformats.org/drawingml/2006/picture">
+                <pic:pic xmlns:pic="http://schemas.openxmlformats.org/drawingml/2006/picture">
+                  <pic:nvPicPr>
+                    <pic:cNvPr id="8713344" name=""/>
+                    <pic:cNvPicPr/>
+                  </pic:nvPicPr>
+                  <pic:blipFill>
+                    <a:blip r:embed="rId9"/>
+                    <a:stretch>
+                      <a:fillRect/>
+                    </a:stretch>
+                  </pic:blipFill>
+                  <pic:spPr>
+                    <a:xfrm>
+                      <a:off x="0" y="0"/>
+                      <a:ext cx="5943600" cy="2434590"/>
+                    </a:xfrm>
+                    <a:prstGeom prst="rect">
+                      <a:avLst/>
+                    </a:prstGeom>
+                  </pic:spPr>
+                </pic:pic>
+              </a:graphicData>
+            </a:graphic>
+          </wp:inline>
+        </w:drawing>
+      </w:r>
       <w:r>
         <w:rPr>
           <w:rFonts w:ascii="Times New Roman" w:eastAsia="Times New Roman" w:hAnsi="Times New Roman" w:cs="Times New Roman"/>
@@ -3099,7 +3776,51 @@
           <w:kern w:val="0"/>
           <w14:ligatures w14:val="none"/>
         </w:rPr>
-        <w:t>[INSERT IMAGE: adaptive_vs_static.png — width 5.5"]</w:t>
+        <w:drawing>
+          <wp:inline distT="0" distB="0" distL="0" distR="0" wp14:anchorId="36F47AC8" wp14:editId="1E4FDDA4">
+            <wp:extent cx="5943600" cy="2434590"/>
+            <wp:effectExtent l="0" t="0" r="0" b="3810"/>
+            <wp:docPr id="189953118" name="Picture 1"/>
+            <wp:cNvGraphicFramePr>
+              <a:graphicFrameLocks xmlns:a="http://schemas.openxmlformats.org/drawingml/2006/main" noChangeAspect="1"/>
+            </wp:cNvGraphicFramePr>
+            <a:graphic xmlns:a="http://schemas.openxmlformats.org/drawingml/2006/main">
+              <a:graphicData uri="http://schemas.openxmlformats.org/drawingml/2006/picture">
+                <pic:pic xmlns:pic="http://schemas.openxmlformats.org/drawingml/2006/picture">
+                  <pic:nvPicPr>
+                    <pic:cNvPr id="189953118" name=""/>
+                    <pic:cNvPicPr/>
+                  </pic:nvPicPr>
+                  <pic:blipFill>
+                    <a:blip r:embed="rId10"/>
+                    <a:stretch>
+                      <a:fillRect/>
+                    </a:stretch>
+                  </pic:blipFill>
+                  <pic:spPr>
+                    <a:xfrm>
+                      <a:off x="0" y="0"/>
+                      <a:ext cx="5943600" cy="2434590"/>
+                    </a:xfrm>
+                    <a:prstGeom prst="rect">
+                      <a:avLst/>
+                    </a:prstGeom>
+                  </pic:spPr>
+                </pic:pic>
+              </a:graphicData>
+            </a:graphic>
+          </wp:inline>
+        </w:drawing>
+      </w:r>
+      <w:r>
+        <w:rPr>
+          <w:rFonts w:ascii="Times New Roman" w:eastAsia="Times New Roman" w:hAnsi="Times New Roman" w:cs="Times New Roman"/>
+          <w:i/>
+          <w:iCs/>
+          <w:kern w:val="0"/>
+          <w14:ligatures w14:val="none"/>
+        </w:rPr>
+        <w:t>Figure 3. Adaptive learner (blue) vs static frozen baseline (orange). Post-drift period shaded red. The adaptive learner partially recovers; the static baseline is locked at the inverted rule.</w:t>
       </w:r>
     </w:p>
     <w:p>
@@ -3114,53 +3835,34 @@
       <w:r>
         <w:rPr>
           <w:rFonts w:ascii="Times New Roman" w:eastAsia="Times New Roman" w:hAnsi="Times New Roman" w:cs="Times New Roman"/>
-          <w:i/>
-          <w:iCs/>
-          <w:kern w:val="0"/>
-          <w14:ligatures w14:val="none"/>
-        </w:rPr>
-        <w:t>Figure 3. Adaptive learner (blue) vs static frozen baseline (orange). Post-drift period shaded red. The adaptive learner partially recovers; the static baseline is locked at the inverted rule.</w:t>
+          <w:kern w:val="0"/>
+          <w14:ligatures w14:val="none"/>
+        </w:rPr>
+        <w:lastRenderedPageBreak/>
+        <w:t xml:space="preserve">Online-learning record saved as </w:t>
+      </w:r>
+      <w:r>
+        <w:rPr>
+          <w:rFonts w:ascii="Courier New" w:eastAsia="Times New Roman" w:hAnsi="Courier New" w:cs="Courier New"/>
+          <w:kern w:val="0"/>
+          <w:sz w:val="20"/>
+          <w:szCs w:val="20"/>
+          <w14:ligatures w14:val="none"/>
+        </w:rPr>
+        <w:t>results/online_run_card.yaml</w:t>
+      </w:r>
+      <w:r>
+        <w:rPr>
+          <w:rFonts w:ascii="Times New Roman" w:eastAsia="Times New Roman" w:hAnsi="Times New Roman" w:cs="Times New Roman"/>
+          <w:kern w:val="0"/>
+          <w14:ligatures w14:val="none"/>
+        </w:rPr>
+        <w:t>.</w:t>
       </w:r>
     </w:p>
     <w:p>
       <w:pPr>
         <w:spacing w:before="100" w:beforeAutospacing="1" w:after="100" w:afterAutospacing="1" w:line="240" w:lineRule="auto"/>
-        <w:rPr>
-          <w:rFonts w:ascii="Times New Roman" w:eastAsia="Times New Roman" w:hAnsi="Times New Roman" w:cs="Times New Roman"/>
-          <w:kern w:val="0"/>
-          <w14:ligatures w14:val="none"/>
-        </w:rPr>
-      </w:pPr>
-      <w:r>
-        <w:rPr>
-          <w:rFonts w:ascii="Times New Roman" w:eastAsia="Times New Roman" w:hAnsi="Times New Roman" w:cs="Times New Roman"/>
-          <w:kern w:val="0"/>
-          <w14:ligatures w14:val="none"/>
-        </w:rPr>
-        <w:t xml:space="preserve">Online-learning record saved as </w:t>
-      </w:r>
-      <w:r>
-        <w:rPr>
-          <w:rFonts w:ascii="Courier New" w:eastAsia="Times New Roman" w:hAnsi="Courier New" w:cs="Courier New"/>
-          <w:kern w:val="0"/>
-          <w:sz w:val="20"/>
-          <w:szCs w:val="20"/>
-          <w14:ligatures w14:val="none"/>
-        </w:rPr>
-        <w:t>results/online_run_card.yaml</w:t>
-      </w:r>
-      <w:r>
-        <w:rPr>
-          <w:rFonts w:ascii="Times New Roman" w:eastAsia="Times New Roman" w:hAnsi="Times New Roman" w:cs="Times New Roman"/>
-          <w:kern w:val="0"/>
-          <w14:ligatures w14:val="none"/>
-        </w:rPr>
-        <w:t>.</w:t>
-      </w:r>
-    </w:p>
-    <w:p>
-      <w:pPr>
-        <w:spacing w:before="100" w:beforeAutospacing="1" w:after="100" w:afterAutospacing="1" w:line="240" w:lineRule="auto"/>
         <w:outlineLvl w:val="2"/>
         <w:rPr>
           <w:rFonts w:ascii="Times New Roman" w:eastAsia="Times New Roman" w:hAnsi="Times New Roman" w:cs="Times New Roman"/>
@@ -3182,7 +3884,6 @@
           <w:szCs w:val="27"/>
           <w14:ligatures w14:val="none"/>
         </w:rPr>
-        <w:lastRenderedPageBreak/>
         <w:t>7. Insights and Decisions</w:t>
       </w:r>
     </w:p>
@@ -3417,8 +4118,8 @@
     </w:p>
     <w:p/>
     <w:sectPr>
-      <w:footerReference w:type="even" r:id="rId7"/>
-      <w:footerReference w:type="default" r:id="rId8"/>
+      <w:footerReference w:type="even" r:id="rId11"/>
+      <w:footerReference w:type="default" r:id="rId12"/>
       <w:pgSz w:w="12240" w:h="15840"/>
       <w:pgMar w:top="1440" w:right="1440" w:bottom="1440" w:left="1440" w:header="708" w:footer="708" w:gutter="0"/>
       <w:cols w:space="708"/>

</xml_diff>